<commit_message>
Add telecom.. industry to week 5 report
</commit_message>
<xml_diff>
--- a/Week 5/onwusaChukwudiTelcoCustomerChurnAnalysisReport.docx
+++ b/Week 5/onwusaChukwudiTelcoCustomerChurnAnalysisReport.docx
@@ -67,13 +67,13 @@
         <w:rPr>
           <w:rFonts w:ascii="Times New Roman" w:hAnsi="Times New Roman" w:cs="Times New Roman"/>
         </w:rPr>
-        <w:t>Telco Organization</w:t>
-      </w:r>
-      <w:r>
-        <w:rPr>
-          <w:rFonts w:ascii="Times New Roman" w:hAnsi="Times New Roman" w:cs="Times New Roman"/>
-        </w:rPr>
-        <w:t>, keeping existing customers is just as important as gaining new ones. When customers stop using a service</w:t>
+        <w:t>telecommunication industry,</w:t>
+      </w:r>
+      <w:r>
+        <w:rPr>
+          <w:rFonts w:ascii="Times New Roman" w:hAnsi="Times New Roman" w:cs="Times New Roman"/>
+        </w:rPr>
+        <w:t xml:space="preserve"> keeping existing customers is just as important as gaining new ones. When customers stop using a service</w:t>
       </w:r>
       <w:r>
         <w:rPr>

</xml_diff>